<commit_message>
docs: document Quick Service lifecycle bypass logic and interactive stepper in user manuals
</commit_message>
<xml_diff>
--- a/NexTime_System_Training_Manual.docx
+++ b/NexTime_System_Training_Manual.docx
@@ -1513,6 +1513,99 @@
     </w:p>
     <w:p>
       <w:pPr>
+        <w:keepNext/>
+        <w:spacing w:before="160" w:after="60"/>
+      </w:pPr>
+      <w:r>
+        <w:rPr>
+          <w:rFonts w:ascii="Calibri" w:hAnsi="Calibri"/>
+          <w:b/>
+          <w:color w:val="475569"/>
+          <w:sz w:val="23"/>
+        </w:rPr>
+        <w:t>💡 ระบบรองรับเวิร์กโฟลว์ 2 รูปแบบยืดหยุ่น:</w:t>
+      </w:r>
+    </w:p>
+    <w:p>
+      <w:pPr>
+        <w:pStyle w:val="ListBullet"/>
+        <w:spacing w:before="30" w:after="30" w:line="276" w:lineRule="auto"/>
+        <w:ind w:left="360"/>
+      </w:pPr>
+      <w:r>
+        <w:rPr>
+          <w:color w:val="334155"/>
+        </w:rPr>
+        <w:t>Standard Workflow (โครงการทั่วไป):** ดำเนินการเต็มรูปแบบครบทั้ง 4 ระยะ (Phase 1: Lead &amp; Survey ➔ Phase 2: Design &amp; Quote ➔ Phase 3: Project Execution ➔ Phase 4: QC, Handover &amp; After-Sales)</w:t>
+      </w:r>
+    </w:p>
+    <w:p>
+      <w:pPr>
+        <w:pStyle w:val="ListBullet"/>
+        <w:spacing w:before="30" w:after="30" w:line="276" w:lineRule="auto"/>
+        <w:ind w:left="360"/>
+      </w:pPr>
+      <w:r>
+        <w:rPr>
+          <w:color w:val="334155"/>
+        </w:rPr>
+        <w:t>Quick Service Workflow (โครงการด่วน / รหัส PQ):**</w:t>
+      </w:r>
+    </w:p>
+    <w:p>
+      <w:pPr>
+        <w:pStyle w:val="ListBullet"/>
+        <w:spacing w:before="30" w:after="30" w:line="276" w:lineRule="auto"/>
+        <w:ind w:left="720"/>
+      </w:pPr>
+      <w:r>
+        <w:rPr>
+          <w:color w:val="334155"/>
+        </w:rPr>
+        <w:t>ออกแบบมาเฉพาะสำหรับงานบริการด่วน ติดตั้งอุปกรณ์มาตรฐาน หรืองานซ่อมบำรุง</w:t>
+      </w:r>
+    </w:p>
+    <w:p>
+      <w:pPr>
+        <w:pStyle w:val="ListBullet"/>
+        <w:spacing w:before="30" w:after="30" w:line="276" w:lineRule="auto"/>
+        <w:ind w:left="720"/>
+      </w:pPr>
+      <w:r>
+        <w:rPr>
+          <w:color w:val="334155"/>
+        </w:rPr>
+        <w:t>ระบบจะข้ามขั้นตอน Phase 1 (สำรวจหน้างาน) และ Phase 2 (ออกแบบและเสนอราคา) ให้โดยอัตโนมัติ (Automated Bypass)**</w:t>
+      </w:r>
+    </w:p>
+    <w:p>
+      <w:pPr>
+        <w:pStyle w:val="ListBullet"/>
+        <w:spacing w:before="30" w:after="30" w:line="276" w:lineRule="auto"/>
+        <w:ind w:left="720"/>
+      </w:pPr>
+      <w:r>
+        <w:rPr>
+          <w:color w:val="334155"/>
+        </w:rPr>
+        <w:t xml:space="preserve">ระบบจะบันทึกสถานะการอนุมัติแบบร่างและการชำระเงินมัดจำล่วงหน้าเป็น True ทันที พร้อมแนบหลักฐานอ้างอิงเป็นเลขตั๋วชำระเงิน (Payment Ticket) ที่ส่งมาจากระบบภายนอก เพื่อปลดล็อกให้ผู้จัดการงานเข้าสู่ </w:t>
+      </w:r>
+      <w:r>
+        <w:rPr>
+          <w:b/>
+          <w:color w:val="0F172A"/>
+        </w:rPr>
+        <w:t>Phase 3 (Project Execution)</w:t>
+      </w:r>
+      <w:r>
+        <w:rPr>
+          <w:color w:val="334155"/>
+        </w:rPr>
+        <w:t xml:space="preserve"> เพื่อส่งช่างติดตั้งเข้าปฏิบัติงานได้ทันที</w:t>
+      </w:r>
+    </w:p>
+    <w:p>
+      <w:pPr>
         <w:spacing w:before="120" w:after="120"/>
       </w:pPr>
       <w:r>
@@ -1859,7 +1952,7 @@
           <w:color w:val="334155"/>
           <w:sz w:val="25"/>
         </w:rPr>
-        <w:t>4.2 สำหรับผู้จัดการโครงการ (Project Manager / PM)</w:t>
+        <w:t>4.2 สำหรับฝ่ายขายและผู้จัดการโครงการ (Sales &amp; Project Manager / PM)</w:t>
       </w:r>
     </w:p>
     <w:p>
@@ -1874,7 +1967,224 @@
           <w:color w:val="475569"/>
           <w:sz w:val="23"/>
         </w:rPr>
-        <w:t>ก. การสร้างโครงการใหม่ (Create New Project)</w:t>
+        <w:t>ก. การรับ Lead และนัดหมายสำรวจหน้างาน (Lead &amp; Smart Survey Booking - ขั้นตอนที่ 1 &amp; 2)</w:t>
+      </w:r>
+    </w:p>
+    <w:p>
+      <w:pPr>
+        <w:spacing w:before="40" w:after="40" w:line="276" w:lineRule="auto"/>
+        <w:ind w:left="360"/>
+      </w:pPr>
+      <w:r>
+        <w:rPr>
+          <w:b/>
+          <w:color w:val="0284C7"/>
+        </w:rPr>
+        <w:t xml:space="preserve">1. </w:t>
+      </w:r>
+      <w:r>
+        <w:t xml:space="preserve">ไปที่เมนู </w:t>
+      </w:r>
+      <w:r>
+        <w:rPr>
+          <w:b/>
+        </w:rPr>
+        <w:t>"Leads" (`/leads`)</w:t>
+      </w:r>
+      <w:r/>
+    </w:p>
+    <w:p>
+      <w:pPr>
+        <w:spacing w:before="40" w:after="40" w:line="276" w:lineRule="auto"/>
+        <w:ind w:left="360"/>
+      </w:pPr>
+      <w:r>
+        <w:rPr>
+          <w:b/>
+          <w:color w:val="0284C7"/>
+        </w:rPr>
+        <w:t xml:space="preserve">2. </w:t>
+      </w:r>
+      <w:r>
+        <w:t xml:space="preserve">คลิกปุ่ม </w:t>
+      </w:r>
+      <w:r>
+        <w:rPr>
+          <w:b/>
+        </w:rPr>
+        <w:t>"+ Add Lead"</w:t>
+      </w:r>
+      <w:r>
+        <w:t xml:space="preserve"> เพื่อบันทึกข้อมูลลูกค้าใหม่ หรือคลิกที่ Lead เดิมเพื่อติดตามงาน (Follow-up)</w:t>
+      </w:r>
+    </w:p>
+    <w:p>
+      <w:pPr>
+        <w:spacing w:before="40" w:after="40" w:line="276" w:lineRule="auto"/>
+        <w:ind w:left="360"/>
+      </w:pPr>
+      <w:r>
+        <w:rPr>
+          <w:b/>
+          <w:color w:val="0284C7"/>
+        </w:rPr>
+        <w:t xml:space="preserve">3. </w:t>
+      </w:r>
+      <w:r>
+        <w:t xml:space="preserve">เมื่อสถานะเข้าสู่การนัดหมายสำรวจ ให้กรอกข้อมูล </w:t>
+      </w:r>
+      <w:r>
+        <w:rPr>
+          <w:b/>
+        </w:rPr>
+        <w:t>Site Visit &amp; Logistics</w:t>
+      </w:r>
+      <w:r>
+        <w:t>:</w:t>
+      </w:r>
+    </w:p>
+    <w:p>
+      <w:pPr>
+        <w:pStyle w:val="ListBullet"/>
+        <w:spacing w:before="30" w:after="30" w:line="276" w:lineRule="auto"/>
+        <w:ind w:left="720"/>
+      </w:pPr>
+      <w:r>
+        <w:rPr>
+          <w:color w:val="334155"/>
+        </w:rPr>
+        <w:t>ข้อมูลผู้ประสานงานหน้างาน:** ชื่อผู้ประสานงาน, เบอร์โทรศัพท์ และ LINE ID</w:t>
+      </w:r>
+    </w:p>
+    <w:p>
+      <w:pPr>
+        <w:pStyle w:val="ListBullet"/>
+        <w:spacing w:before="30" w:after="30" w:line="276" w:lineRule="auto"/>
+        <w:ind w:left="720"/>
+      </w:pPr>
+      <w:r>
+        <w:rPr>
+          <w:color w:val="334155"/>
+        </w:rPr>
+        <w:t>พิกัดแผนที่ (Smart GPS/DMS):</w:t>
+      </w:r>
+      <w:r>
+        <w:rPr>
+          <w:b/>
+          <w:color w:val="0F172A"/>
+        </w:rPr>
+        <w:t xml:space="preserve"> วางลิงก์ Google Maps หรือพิกัดองศาลิปดา (DMS) ระบบจะแสดง </w:t>
+      </w:r>
+      <w:r>
+        <w:rPr>
+          <w:color w:val="334155"/>
+        </w:rPr>
+        <w:t>Live Google Maps Preview** ตรวจสอบตำแหน่งจริง</w:t>
+      </w:r>
+    </w:p>
+    <w:p>
+      <w:pPr>
+        <w:pStyle w:val="ListBullet"/>
+        <w:spacing w:before="30" w:after="30" w:line="276" w:lineRule="auto"/>
+        <w:ind w:left="720"/>
+      </w:pPr>
+      <w:r>
+        <w:rPr>
+          <w:color w:val="334155"/>
+        </w:rPr>
+        <w:t>วัน-เวลานัดหมาย (survey_date):** เลือกวันและเวลาที่ลูกค้านัดเข้าตรวจสอบ</w:t>
+      </w:r>
+    </w:p>
+    <w:p>
+      <w:pPr>
+        <w:pStyle w:val="ListBullet"/>
+        <w:spacing w:before="30" w:after="30" w:line="276" w:lineRule="auto"/>
+        <w:ind w:left="720"/>
+      </w:pPr>
+      <w:r>
+        <w:rPr>
+          <w:color w:val="334155"/>
+        </w:rPr>
+        <w:t>เลือกช่างประเมิน (Smart QC Dispatch):</w:t>
+      </w:r>
+      <w:r>
+        <w:rPr>
+          <w:b/>
+          <w:color w:val="0F172A"/>
+        </w:rPr>
+        <w:t xml:space="preserve"> ระบบจะเรียก API คัดกรองเฉพาะช่างที่มีทักษะ </w:t>
+      </w:r>
+      <w:r>
+        <w:rPr>
+          <w:color w:val="334155"/>
+        </w:rPr>
+        <w:t>QC** ที่คิวว่างจริง (ไม่มีงานอื่นซ้อนทับในรัศมี &amp;plusmn;3 ชั่วโมง)</w:t>
+      </w:r>
+    </w:p>
+    <w:p>
+      <w:pPr>
+        <w:spacing w:before="40" w:after="40" w:line="276" w:lineRule="auto"/>
+        <w:ind w:left="360"/>
+      </w:pPr>
+      <w:r>
+        <w:rPr>
+          <w:b/>
+          <w:color w:val="0284C7"/>
+        </w:rPr>
+        <w:t xml:space="preserve">4. </w:t>
+      </w:r>
+      <w:r>
+        <w:t xml:space="preserve">คลิก </w:t>
+      </w:r>
+      <w:r>
+        <w:rPr>
+          <w:b/>
+        </w:rPr>
+        <w:t>"Convert to Project"</w:t>
+      </w:r>
+      <w:r>
+        <w:t xml:space="preserve"> เพื่อแปลง Lead เป็นโครงการจริง:</w:t>
+      </w:r>
+    </w:p>
+    <w:p>
+      <w:pPr>
+        <w:pStyle w:val="ListBullet"/>
+        <w:spacing w:before="30" w:after="30" w:line="276" w:lineRule="auto"/>
+        <w:ind w:left="720"/>
+      </w:pPr>
+      <w:r>
+        <w:rPr>
+          <w:color w:val="334155"/>
+        </w:rPr>
+        <w:t>ระบบจะสร้าง Smart Project ID อัตโนมัติ (เช่น PRBNA2608170001)</w:t>
+      </w:r>
+    </w:p>
+    <w:p>
+      <w:pPr>
+        <w:pStyle w:val="ListBullet"/>
+        <w:spacing w:before="30" w:after="30" w:line="276" w:lineRule="auto"/>
+        <w:ind w:left="720"/>
+      </w:pPr>
+      <w:r>
+        <w:rPr>
+          <w:color w:val="334155"/>
+        </w:rPr>
+        <w:t>ระบบจะสร้างคอลัมน์ Workflow Buy-Survey ➔ Survey บน Kanban บอร์ด เพื่อส่งต่องานเข้าสู่ขั้นตอนที่ 3 (Survey QC Inspection)</w:t>
+      </w:r>
+    </w:p>
+    <w:p>
+      <w:pPr>
+        <w:keepNext/>
+        <w:spacing w:before="160" w:after="60"/>
+      </w:pPr>
+      <w:r>
+        <w:rPr>
+          <w:rFonts w:ascii="Calibri" w:hAnsi="Calibri"/>
+          <w:b/>
+          <w:color w:val="475569"/>
+          <w:sz w:val="23"/>
+        </w:rPr>
+        <w:t>ข. การสร้างโครงการใหม่โดยตรง (Create New Project)</w:t>
       </w:r>
     </w:p>
     <w:p>

</xml_diff>

<commit_message>
fix(leads): resolve duplicate id collision and ensure customers tables migration
</commit_message>
<xml_diff>
--- a/NexTime_System_Training_Manual.docx
+++ b/NexTime_System_Training_Manual.docx
@@ -1606,6 +1606,554 @@
     </w:p>
     <w:p>
       <w:pPr>
+        <w:keepNext/>
+        <w:spacing w:before="160" w:after="60"/>
+      </w:pPr>
+      <w:r>
+        <w:rPr>
+          <w:rFonts w:ascii="Calibri" w:hAnsi="Calibri"/>
+          <w:b/>
+          <w:color w:val="475569"/>
+          <w:sz w:val="23"/>
+        </w:rPr>
+        <w:t>🏛️ ตารางสรุปโมดูลระบบแยกตาม 4 Phases (4-Phase Architecture Matrix):</w:t>
+      </w:r>
+    </w:p>
+    <w:tbl>
+      <w:tblPr>
+        <w:tblW w:type="auto" w:w="0"/>
+        <w:jc w:val="center"/>
+        <w:tblLayout w:type="autofit"/>
+        <w:tblLook w:firstColumn="1" w:firstRow="1" w:lastColumn="0" w:lastRow="0" w:noHBand="0" w:noVBand="1" w:val="04A0"/>
+      </w:tblPr>
+      <w:tblGrid>
+        <w:gridCol w:w="2484"/>
+        <w:gridCol w:w="2484"/>
+        <w:gridCol w:w="2484"/>
+        <w:gridCol w:w="2484"/>
+      </w:tblGrid>
+      <w:tr>
+        <w:tc>
+          <w:tcPr>
+            <w:tcW w:type="dxa" w:w="2484"/>
+            <w:tcMar>
+              <w:top w:w="120" w:type="dxa"/>
+              <w:bottom w:w="120" w:type="dxa"/>
+              <w:left w:w="160" w:type="dxa"/>
+              <w:right w:w="160" w:type="dxa"/>
+            </w:tcMar>
+            <w:shd w:val="clear" w:color="auto" w:fill="1E293B"/>
+          </w:tcPr>
+          <w:p>
+            <w:pPr>
+              <w:spacing w:before="40" w:after="40" w:line="276" w:lineRule="auto"/>
+            </w:pPr>
+            <w:r>
+              <w:rPr>
+                <w:rFonts w:ascii="Calibri" w:hAnsi="Calibri"/>
+                <w:b/>
+                <w:color w:val="FFFFFF"/>
+                <w:sz w:val="19"/>
+              </w:rPr>
+              <w:t>Phase</w:t>
+            </w:r>
+          </w:p>
+        </w:tc>
+        <w:tc>
+          <w:tcPr>
+            <w:tcW w:type="dxa" w:w="2484"/>
+            <w:tcMar>
+              <w:top w:w="120" w:type="dxa"/>
+              <w:bottom w:w="120" w:type="dxa"/>
+              <w:left w:w="160" w:type="dxa"/>
+              <w:right w:w="160" w:type="dxa"/>
+            </w:tcMar>
+            <w:shd w:val="clear" w:color="auto" w:fill="1E293B"/>
+          </w:tcPr>
+          <w:p>
+            <w:pPr>
+              <w:spacing w:before="40" w:after="40" w:line="276" w:lineRule="auto"/>
+            </w:pPr>
+            <w:r>
+              <w:rPr>
+                <w:rFonts w:ascii="Calibri" w:hAnsi="Calibri"/>
+                <w:b/>
+                <w:color w:val="FFFFFF"/>
+                <w:sz w:val="19"/>
+              </w:rPr>
+              <w:t>วัตถุประสงค์หลัก</w:t>
+            </w:r>
+          </w:p>
+        </w:tc>
+        <w:tc>
+          <w:tcPr>
+            <w:tcW w:type="dxa" w:w="2484"/>
+            <w:tcMar>
+              <w:top w:w="120" w:type="dxa"/>
+              <w:bottom w:w="120" w:type="dxa"/>
+              <w:left w:w="160" w:type="dxa"/>
+              <w:right w:w="160" w:type="dxa"/>
+            </w:tcMar>
+            <w:shd w:val="clear" w:color="auto" w:fill="1E293B"/>
+          </w:tcPr>
+          <w:p>
+            <w:pPr>
+              <w:spacing w:before="40" w:after="40" w:line="276" w:lineRule="auto"/>
+            </w:pPr>
+            <w:r>
+              <w:rPr>
+                <w:rFonts w:ascii="Calibri" w:hAnsi="Calibri"/>
+                <w:b/>
+                <w:color w:val="FFFFFF"/>
+                <w:sz w:val="19"/>
+              </w:rPr>
+              <w:t>โมดูล/หน้าจอที่ใช้งาน</w:t>
+            </w:r>
+          </w:p>
+        </w:tc>
+        <w:tc>
+          <w:tcPr>
+            <w:tcW w:type="dxa" w:w="2484"/>
+            <w:tcMar>
+              <w:top w:w="120" w:type="dxa"/>
+              <w:bottom w:w="120" w:type="dxa"/>
+              <w:left w:w="160" w:type="dxa"/>
+              <w:right w:w="160" w:type="dxa"/>
+            </w:tcMar>
+            <w:shd w:val="clear" w:color="auto" w:fill="1E293B"/>
+          </w:tcPr>
+          <w:p>
+            <w:pPr>
+              <w:spacing w:before="40" w:after="40" w:line="276" w:lineRule="auto"/>
+            </w:pPr>
+            <w:r>
+              <w:rPr>
+                <w:rFonts w:ascii="Calibri" w:hAnsi="Calibri"/>
+                <w:b/>
+                <w:color w:val="FFFFFF"/>
+                <w:sz w:val="19"/>
+              </w:rPr>
+              <w:t>สิ่งที่ได้รับ (Deliverables)</w:t>
+            </w:r>
+          </w:p>
+        </w:tc>
+      </w:tr>
+      <w:tr>
+        <w:tc>
+          <w:tcPr>
+            <w:tcW w:type="dxa" w:w="2484"/>
+            <w:tcMar>
+              <w:top w:w="120" w:type="dxa"/>
+              <w:bottom w:w="120" w:type="dxa"/>
+              <w:left w:w="160" w:type="dxa"/>
+              <w:right w:w="160" w:type="dxa"/>
+            </w:tcMar>
+            <w:shd w:val="clear" w:color="auto" w:fill="F8FAFC"/>
+          </w:tcPr>
+          <w:p>
+            <w:pPr>
+              <w:spacing w:before="40" w:after="40" w:line="276" w:lineRule="auto"/>
+            </w:pPr>
+            <w:r>
+              <w:rPr>
+                <w:rFonts w:ascii="Calibri" w:hAnsi="Calibri"/>
+                <w:color w:val="333333"/>
+                <w:sz w:val="19"/>
+              </w:rPr>
+              <w:t>Phase 01: Lead &amp; Survey</w:t>
+            </w:r>
+          </w:p>
+        </w:tc>
+        <w:tc>
+          <w:tcPr>
+            <w:tcW w:type="dxa" w:w="2484"/>
+            <w:tcMar>
+              <w:top w:w="120" w:type="dxa"/>
+              <w:bottom w:w="120" w:type="dxa"/>
+              <w:left w:w="160" w:type="dxa"/>
+              <w:right w:w="160" w:type="dxa"/>
+            </w:tcMar>
+            <w:shd w:val="clear" w:color="auto" w:fill="F8FAFC"/>
+          </w:tcPr>
+          <w:p>
+            <w:pPr>
+              <w:spacing w:before="40" w:after="40" w:line="276" w:lineRule="auto"/>
+            </w:pPr>
+            <w:r>
+              <w:rPr>
+                <w:rFonts w:ascii="Calibri" w:hAnsi="Calibri"/>
+                <w:color w:val="333333"/>
+                <w:sz w:val="19"/>
+              </w:rPr>
+              <w:t>รับข้อมูลลูกค้า, นัดหมายสำรวจ และสรุปผลหน้างาน</w:t>
+            </w:r>
+          </w:p>
+        </w:tc>
+        <w:tc>
+          <w:tcPr>
+            <w:tcW w:type="dxa" w:w="2484"/>
+            <w:tcMar>
+              <w:top w:w="120" w:type="dxa"/>
+              <w:bottom w:w="120" w:type="dxa"/>
+              <w:left w:w="160" w:type="dxa"/>
+              <w:right w:w="160" w:type="dxa"/>
+            </w:tcMar>
+            <w:shd w:val="clear" w:color="auto" w:fill="F8FAFC"/>
+          </w:tcPr>
+          <w:p>
+            <w:pPr>
+              <w:spacing w:before="40" w:after="40" w:line="276" w:lineRule="auto"/>
+            </w:pPr>
+            <w:r>
+              <w:rPr>
+                <w:rFonts w:ascii="Calibri" w:hAnsi="Calibri"/>
+                <w:color w:val="333333"/>
+                <w:sz w:val="19"/>
+              </w:rPr>
+              <w:t>• `LeadsPage.tsx`&lt;br/&gt;• `SiteVisitResultModal.tsx`</w:t>
+            </w:r>
+          </w:p>
+        </w:tc>
+        <w:tc>
+          <w:tcPr>
+            <w:tcW w:type="dxa" w:w="2484"/>
+            <w:tcMar>
+              <w:top w:w="120" w:type="dxa"/>
+              <w:bottom w:w="120" w:type="dxa"/>
+              <w:left w:w="160" w:type="dxa"/>
+              <w:right w:w="160" w:type="dxa"/>
+            </w:tcMar>
+            <w:shd w:val="clear" w:color="auto" w:fill="F8FAFC"/>
+          </w:tcPr>
+          <w:p>
+            <w:pPr>
+              <w:spacing w:before="40" w:after="40" w:line="276" w:lineRule="auto"/>
+            </w:pPr>
+            <w:r>
+              <w:rPr>
+                <w:rFonts w:ascii="Calibri" w:hAnsi="Calibri"/>
+                <w:color w:val="333333"/>
+                <w:sz w:val="19"/>
+              </w:rPr>
+              <w:t>ข้อมูลสภาพหน้างานจริง, ขอบเขตงาน และประมาณการงบเบื้องต้น</w:t>
+            </w:r>
+          </w:p>
+        </w:tc>
+      </w:tr>
+      <w:tr>
+        <w:tc>
+          <w:tcPr>
+            <w:tcW w:type="dxa" w:w="2484"/>
+            <w:tcMar>
+              <w:top w:w="120" w:type="dxa"/>
+              <w:bottom w:w="120" w:type="dxa"/>
+              <w:left w:w="160" w:type="dxa"/>
+              <w:right w:w="160" w:type="dxa"/>
+            </w:tcMar>
+            <w:shd w:val="clear" w:color="auto" w:fill="FFFFFF"/>
+          </w:tcPr>
+          <w:p>
+            <w:pPr>
+              <w:spacing w:before="40" w:after="40" w:line="276" w:lineRule="auto"/>
+            </w:pPr>
+            <w:r>
+              <w:rPr>
+                <w:rFonts w:ascii="Calibri" w:hAnsi="Calibri"/>
+                <w:color w:val="333333"/>
+                <w:sz w:val="19"/>
+              </w:rPr>
+              <w:t>Phase 02: Design, Quote &amp; Payment</w:t>
+            </w:r>
+          </w:p>
+        </w:tc>
+        <w:tc>
+          <w:tcPr>
+            <w:tcW w:type="dxa" w:w="2484"/>
+            <w:tcMar>
+              <w:top w:w="120" w:type="dxa"/>
+              <w:bottom w:w="120" w:type="dxa"/>
+              <w:left w:w="160" w:type="dxa"/>
+              <w:right w:w="160" w:type="dxa"/>
+            </w:tcMar>
+            <w:shd w:val="clear" w:color="auto" w:fill="FFFFFF"/>
+          </w:tcPr>
+          <w:p>
+            <w:pPr>
+              <w:spacing w:before="40" w:after="40" w:line="276" w:lineRule="auto"/>
+            </w:pPr>
+            <w:r>
+              <w:rPr>
+                <w:rFonts w:ascii="Calibri" w:hAnsi="Calibri"/>
+                <w:color w:val="333333"/>
+                <w:sz w:val="19"/>
+              </w:rPr>
+              <w:t>จัดการตรวจรับแบบ 3D, เสนอราคา BOQ และรับเงินมัดจำ</w:t>
+            </w:r>
+          </w:p>
+        </w:tc>
+        <w:tc>
+          <w:tcPr>
+            <w:tcW w:type="dxa" w:w="2484"/>
+            <w:tcMar>
+              <w:top w:w="120" w:type="dxa"/>
+              <w:bottom w:w="120" w:type="dxa"/>
+              <w:left w:w="160" w:type="dxa"/>
+              <w:right w:w="160" w:type="dxa"/>
+            </w:tcMar>
+            <w:shd w:val="clear" w:color="auto" w:fill="FFFFFF"/>
+          </w:tcPr>
+          <w:p>
+            <w:pPr>
+              <w:spacing w:before="40" w:after="40" w:line="276" w:lineRule="auto"/>
+            </w:pPr>
+            <w:r>
+              <w:rPr>
+                <w:rFonts w:ascii="Calibri" w:hAnsi="Calibri"/>
+                <w:color w:val="333333"/>
+                <w:sz w:val="19"/>
+              </w:rPr>
+              <w:t>• `DesignApprovalModal.tsx`&lt;br/&gt;• `PaymentModal.tsx`&lt;br/&gt;• `QuotationBuilder`</w:t>
+            </w:r>
+          </w:p>
+        </w:tc>
+        <w:tc>
+          <w:tcPr>
+            <w:tcW w:type="dxa" w:w="2484"/>
+            <w:tcMar>
+              <w:top w:w="120" w:type="dxa"/>
+              <w:bottom w:w="120" w:type="dxa"/>
+              <w:left w:w="160" w:type="dxa"/>
+              <w:right w:w="160" w:type="dxa"/>
+            </w:tcMar>
+            <w:shd w:val="clear" w:color="auto" w:fill="FFFFFF"/>
+          </w:tcPr>
+          <w:p>
+            <w:pPr>
+              <w:spacing w:before="40" w:after="40" w:line="276" w:lineRule="auto"/>
+            </w:pPr>
+            <w:r>
+              <w:rPr>
+                <w:rFonts w:ascii="Calibri" w:hAnsi="Calibri"/>
+                <w:color w:val="333333"/>
+                <w:sz w:val="19"/>
+              </w:rPr>
+              <w:t>แบบ 2D/3D ที่ลูกค้าอนุมัติ, ใบเสนอราคาอนุมัติ และสลิปมัดจำงวดแรก</w:t>
+            </w:r>
+          </w:p>
+        </w:tc>
+      </w:tr>
+      <w:tr>
+        <w:tc>
+          <w:tcPr>
+            <w:tcW w:type="dxa" w:w="2484"/>
+            <w:tcMar>
+              <w:top w:w="120" w:type="dxa"/>
+              <w:bottom w:w="120" w:type="dxa"/>
+              <w:left w:w="160" w:type="dxa"/>
+              <w:right w:w="160" w:type="dxa"/>
+            </w:tcMar>
+            <w:shd w:val="clear" w:color="auto" w:fill="F8FAFC"/>
+          </w:tcPr>
+          <w:p>
+            <w:pPr>
+              <w:spacing w:before="40" w:after="40" w:line="276" w:lineRule="auto"/>
+            </w:pPr>
+            <w:r>
+              <w:rPr>
+                <w:rFonts w:ascii="Calibri" w:hAnsi="Calibri"/>
+                <w:color w:val="333333"/>
+                <w:sz w:val="19"/>
+              </w:rPr>
+              <w:t>Phase 03: Project Execution</w:t>
+            </w:r>
+          </w:p>
+        </w:tc>
+        <w:tc>
+          <w:tcPr>
+            <w:tcW w:type="dxa" w:w="2484"/>
+            <w:tcMar>
+              <w:top w:w="120" w:type="dxa"/>
+              <w:bottom w:w="120" w:type="dxa"/>
+              <w:left w:w="160" w:type="dxa"/>
+              <w:right w:w="160" w:type="dxa"/>
+            </w:tcMar>
+            <w:shd w:val="clear" w:color="auto" w:fill="F8FAFC"/>
+          </w:tcPr>
+          <w:p>
+            <w:pPr>
+              <w:spacing w:before="40" w:after="40" w:line="276" w:lineRule="auto"/>
+            </w:pPr>
+            <w:r>
+              <w:rPr>
+                <w:rFonts w:ascii="Calibri" w:hAnsi="Calibri"/>
+                <w:color w:val="333333"/>
+                <w:sz w:val="19"/>
+              </w:rPr>
+              <w:t>สร้างแผนงาน WBS, มอบหมายช่าง JMT และเช็คอิน GPS</w:t>
+            </w:r>
+          </w:p>
+        </w:tc>
+        <w:tc>
+          <w:tcPr>
+            <w:tcW w:type="dxa" w:w="2484"/>
+            <w:tcMar>
+              <w:top w:w="120" w:type="dxa"/>
+              <w:bottom w:w="120" w:type="dxa"/>
+              <w:left w:w="160" w:type="dxa"/>
+              <w:right w:w="160" w:type="dxa"/>
+            </w:tcMar>
+            <w:shd w:val="clear" w:color="auto" w:fill="F8FAFC"/>
+          </w:tcPr>
+          <w:p>
+            <w:pPr>
+              <w:spacing w:before="40" w:after="40" w:line="276" w:lineRule="auto"/>
+            </w:pPr>
+            <w:r>
+              <w:rPr>
+                <w:rFonts w:ascii="Calibri" w:hAnsi="Calibri"/>
+                <w:color w:val="333333"/>
+                <w:sz w:val="19"/>
+              </w:rPr>
+              <w:t>• `SiteCheckInOut.tsx`&lt;br/&gt;• `ProjectBoard.tsx`&lt;br/&gt;• `ProjectPlan.tsx`</w:t>
+            </w:r>
+          </w:p>
+        </w:tc>
+        <w:tc>
+          <w:tcPr>
+            <w:tcW w:type="dxa" w:w="2484"/>
+            <w:tcMar>
+              <w:top w:w="120" w:type="dxa"/>
+              <w:bottom w:w="120" w:type="dxa"/>
+              <w:left w:w="160" w:type="dxa"/>
+              <w:right w:w="160" w:type="dxa"/>
+            </w:tcMar>
+            <w:shd w:val="clear" w:color="auto" w:fill="F8FAFC"/>
+          </w:tcPr>
+          <w:p>
+            <w:pPr>
+              <w:spacing w:before="40" w:after="40" w:line="276" w:lineRule="auto"/>
+            </w:pPr>
+            <w:r>
+              <w:rPr>
+                <w:rFonts w:ascii="Calibri" w:hAnsi="Calibri"/>
+                <w:color w:val="333333"/>
+                <w:sz w:val="19"/>
+              </w:rPr>
+              <w:t>การเช็คอินพิกัดดาวเทียม (500 ม.), ภาพถ่ายก่อน/หลัง และความคืบหน้า 100%</w:t>
+            </w:r>
+          </w:p>
+        </w:tc>
+      </w:tr>
+      <w:tr>
+        <w:tc>
+          <w:tcPr>
+            <w:tcW w:type="dxa" w:w="2484"/>
+            <w:tcMar>
+              <w:top w:w="120" w:type="dxa"/>
+              <w:bottom w:w="120" w:type="dxa"/>
+              <w:left w:w="160" w:type="dxa"/>
+              <w:right w:w="160" w:type="dxa"/>
+            </w:tcMar>
+            <w:shd w:val="clear" w:color="auto" w:fill="FFFFFF"/>
+          </w:tcPr>
+          <w:p>
+            <w:pPr>
+              <w:spacing w:before="40" w:after="40" w:line="276" w:lineRule="auto"/>
+            </w:pPr>
+            <w:r>
+              <w:rPr>
+                <w:rFonts w:ascii="Calibri" w:hAnsi="Calibri"/>
+                <w:color w:val="333333"/>
+                <w:sz w:val="19"/>
+              </w:rPr>
+              <w:t>Phase 04: QC, Handover &amp; Settle</w:t>
+            </w:r>
+          </w:p>
+        </w:tc>
+        <w:tc>
+          <w:tcPr>
+            <w:tcW w:type="dxa" w:w="2484"/>
+            <w:tcMar>
+              <w:top w:w="120" w:type="dxa"/>
+              <w:bottom w:w="120" w:type="dxa"/>
+              <w:left w:w="160" w:type="dxa"/>
+              <w:right w:w="160" w:type="dxa"/>
+            </w:tcMar>
+            <w:shd w:val="clear" w:color="auto" w:fill="FFFFFF"/>
+          </w:tcPr>
+          <w:p>
+            <w:pPr>
+              <w:spacing w:before="40" w:after="40" w:line="276" w:lineRule="auto"/>
+            </w:pPr>
+            <w:r>
+              <w:rPr>
+                <w:rFonts w:ascii="Calibri" w:hAnsi="Calibri"/>
+                <w:color w:val="333333"/>
+                <w:sz w:val="19"/>
+              </w:rPr>
+              <w:t>ตรวจสอบคุณภาพงาน (Online QC สำหรับ Quick Job / On-site QC สำหรับ Renovate), เซ็นรับมอบงาน และปิดโครงการ</w:t>
+            </w:r>
+          </w:p>
+        </w:tc>
+        <w:tc>
+          <w:tcPr>
+            <w:tcW w:type="dxa" w:w="2484"/>
+            <w:tcMar>
+              <w:top w:w="120" w:type="dxa"/>
+              <w:bottom w:w="120" w:type="dxa"/>
+              <w:left w:w="160" w:type="dxa"/>
+              <w:right w:w="160" w:type="dxa"/>
+            </w:tcMar>
+            <w:shd w:val="clear" w:color="auto" w:fill="FFFFFF"/>
+          </w:tcPr>
+          <w:p>
+            <w:pPr>
+              <w:spacing w:before="40" w:after="40" w:line="276" w:lineRule="auto"/>
+            </w:pPr>
+            <w:r>
+              <w:rPr>
+                <w:rFonts w:ascii="Calibri" w:hAnsi="Calibri"/>
+                <w:color w:val="333333"/>
+                <w:sz w:val="19"/>
+              </w:rPr>
+              <w:t>• `QCHandoverModal.tsx`&lt;br/&gt;• `ProjectDetail.tsx`</w:t>
+            </w:r>
+          </w:p>
+        </w:tc>
+        <w:tc>
+          <w:tcPr>
+            <w:tcW w:type="dxa" w:w="2484"/>
+            <w:tcMar>
+              <w:top w:w="120" w:type="dxa"/>
+              <w:bottom w:w="120" w:type="dxa"/>
+              <w:left w:w="160" w:type="dxa"/>
+              <w:right w:w="160" w:type="dxa"/>
+            </w:tcMar>
+            <w:shd w:val="clear" w:color="auto" w:fill="FFFFFF"/>
+          </w:tcPr>
+          <w:p>
+            <w:pPr>
+              <w:spacing w:before="40" w:after="40" w:line="276" w:lineRule="auto"/>
+            </w:pPr>
+            <w:r>
+              <w:rPr>
+                <w:rFonts w:ascii="Calibri" w:hAnsi="Calibri"/>
+                <w:color w:val="333333"/>
+                <w:sz w:val="19"/>
+              </w:rPr>
+              <w:t>ผลตรวจ QC Pass (Online/On-site), ลายเซ็นดิจิทัล E-Signature, 5 ดาว, ใบรับประกัน และปิด Job</w:t>
+            </w:r>
+          </w:p>
+        </w:tc>
+      </w:tr>
+    </w:tbl>
+    <w:p>
+      <w:pPr>
+        <w:spacing w:after="80"/>
+      </w:pPr>
+    </w:p>
+    <w:p>
+      <w:pPr>
         <w:spacing w:before="120" w:after="120"/>
       </w:pPr>
       <w:r>
@@ -2123,57 +2671,6 @@
     </w:p>
     <w:p>
       <w:pPr>
-        <w:spacing w:before="40" w:after="40" w:line="276" w:lineRule="auto"/>
-        <w:ind w:left="360"/>
-      </w:pPr>
-      <w:r>
-        <w:rPr>
-          <w:b/>
-          <w:color w:val="0284C7"/>
-        </w:rPr>
-        <w:t xml:space="preserve">4. </w:t>
-      </w:r>
-      <w:r>
-        <w:t xml:space="preserve">คลิก </w:t>
-      </w:r>
-      <w:r>
-        <w:rPr>
-          <w:b/>
-        </w:rPr>
-        <w:t>"Convert to Project"</w:t>
-      </w:r>
-      <w:r>
-        <w:t xml:space="preserve"> เพื่อแปลง Lead เป็นโครงการจริง:</w:t>
-      </w:r>
-    </w:p>
-    <w:p>
-      <w:pPr>
-        <w:pStyle w:val="ListBullet"/>
-        <w:spacing w:before="30" w:after="30" w:line="276" w:lineRule="auto"/>
-        <w:ind w:left="720"/>
-      </w:pPr>
-      <w:r>
-        <w:rPr>
-          <w:color w:val="334155"/>
-        </w:rPr>
-        <w:t>ระบบจะสร้าง Smart Project ID อัตโนมัติ (เช่น PRBNA2608170001)</w:t>
-      </w:r>
-    </w:p>
-    <w:p>
-      <w:pPr>
-        <w:pStyle w:val="ListBullet"/>
-        <w:spacing w:before="30" w:after="30" w:line="276" w:lineRule="auto"/>
-        <w:ind w:left="720"/>
-      </w:pPr>
-      <w:r>
-        <w:rPr>
-          <w:color w:val="334155"/>
-        </w:rPr>
-        <w:t>ระบบจะสร้างคอลัมน์ Workflow Buy-Survey ➔ Survey บน Kanban บอร์ด เพื่อส่งต่องานเข้าสู่ขั้นตอนที่ 3 (Survey QC Inspection)</w:t>
-      </w:r>
-    </w:p>
-    <w:p>
-      <w:pPr>
         <w:keepNext/>
         <w:spacing w:before="160" w:after="60"/>
       </w:pPr>
@@ -2184,7 +2681,7 @@
           <w:color w:val="475569"/>
           <w:sz w:val="23"/>
         </w:rPr>
-        <w:t>ข. การสร้างโครงการใหม่โดยตรง (Create New Project)</w:t>
+        <w:t>ข. หัวข้อ: การแปลงเป็นโครงการ (Convert to Project Workflow &amp; Smart Project Pipeline)</w:t>
       </w:r>
     </w:p>
     <w:p>
@@ -2199,19 +2696,68 @@
         </w:rPr>
         <w:t xml:space="preserve">1. </w:t>
       </w:r>
-      <w:r>
-        <w:t xml:space="preserve">ไปที่เมนู </w:t>
-      </w:r>
+      <w:r/>
       <w:r>
         <w:rPr>
           <w:b/>
         </w:rPr>
-        <w:t>"Projects" (`/projects`)</w:t>
+        <w:t>การปลดล็อกปุ่ม Convert (Financial Gatekeeper):</w:t>
       </w:r>
       <w:r/>
     </w:p>
     <w:p>
       <w:pPr>
+        <w:pStyle w:val="ListBullet"/>
+        <w:spacing w:before="30" w:after="30" w:line="276" w:lineRule="auto"/>
+        <w:ind w:left="720"/>
+      </w:pPr>
+      <w:r>
+        <w:rPr>
+          <w:color w:val="334155"/>
+        </w:rPr>
+        <w:t xml:space="preserve">ที่หน้า Leads คลิกปุ่ม </w:t>
+      </w:r>
+      <w:r>
+        <w:rPr>
+          <w:b/>
+          <w:color w:val="0F172A"/>
+        </w:rPr>
+        <w:t>"💰 รับมัดจำ &amp; แปลงงาน"</w:t>
+      </w:r>
+      <w:r>
+        <w:rPr>
+          <w:color w:val="334155"/>
+        </w:rPr>
+        <w:t xml:space="preserve"> บันทึกรับเงินมัดจำ 30% หรือ 50% พร้อมแนบสลิปโอนเงิน</w:t>
+      </w:r>
+    </w:p>
+    <w:p>
+      <w:pPr>
+        <w:pStyle w:val="ListBullet"/>
+        <w:spacing w:before="30" w:after="30" w:line="276" w:lineRule="auto"/>
+        <w:ind w:left="720"/>
+      </w:pPr>
+      <w:r>
+        <w:rPr>
+          <w:color w:val="334155"/>
+        </w:rPr>
+        <w:t xml:space="preserve">หรือคลิกเมนูทางลัดจุด 3 จุด </w:t>
+      </w:r>
+      <w:r>
+        <w:rPr>
+          <w:b/>
+          <w:color w:val="0F172A"/>
+        </w:rPr>
+        <w:t>"🚀 5. แปลงเป็นโครงการ (Convert to Project)"</w:t>
+      </w:r>
+      <w:r>
+        <w:rPr>
+          <w:color w:val="334155"/>
+        </w:rPr>
+      </w:r>
+    </w:p>
+    <w:p>
+      <w:pPr>
         <w:spacing w:before="40" w:after="40" w:line="276" w:lineRule="auto"/>
         <w:ind w:left="360"/>
       </w:pPr>
@@ -2222,35 +2768,17 @@
         </w:rPr>
         <w:t xml:space="preserve">2. </w:t>
       </w:r>
-      <w:r>
-        <w:t xml:space="preserve">คลิกปุ่ม </w:t>
-      </w:r>
+      <w:r/>
       <w:r>
         <w:rPr>
           <w:b/>
         </w:rPr>
-        <w:t>"+ Create Project"</w:t>
+        <w:t>การทำงานอัตโนมัติของระบบเมื่อกด Convert:</w:t>
       </w:r>
       <w:r/>
     </w:p>
     <w:p>
       <w:pPr>
-        <w:spacing w:before="40" w:after="40" w:line="276" w:lineRule="auto"/>
-        <w:ind w:left="360"/>
-      </w:pPr>
-      <w:r>
-        <w:rPr>
-          <w:b/>
-          <w:color w:val="0284C7"/>
-        </w:rPr>
-        <w:t xml:space="preserve">3. </w:t>
-      </w:r>
-      <w:r>
-        <w:t>ระบุรายละเอียด:</w:t>
-      </w:r>
-    </w:p>
-    <w:p>
-      <w:pPr>
         <w:pStyle w:val="ListBullet"/>
         <w:spacing w:before="30" w:after="30" w:line="276" w:lineRule="auto"/>
         <w:ind w:left="720"/>
@@ -2259,7 +2787,7 @@
         <w:rPr>
           <w:color w:val="334155"/>
         </w:rPr>
-        <w:t>Project Code &amp; Name:** รหัสและชื่อโครงการ</w:t>
+        <w:t>ออกรหัส Smart Project ID:** เช่น PRBNA2608170001 (สาขา + ปีเดือนวัน + ลำดับ)</w:t>
       </w:r>
     </w:p>
     <w:p>
@@ -2272,7 +2800,7 @@
         <w:rPr>
           <w:color w:val="334155"/>
         </w:rPr>
-        <w:t>Project Type:** เลือกประเภทโครงการ (ระบบจะเตรียม Milestone Template ที่เกี่ยวข้องให้)</w:t>
+        <w:t>สืบทอดพิกัด GPS &amp; Geofence 500m:** ส่งต่อพิกัดไซต์งานสู่โครงการเพื่อให้ช่างใช้ Check-In หน้างานได้ทันที</w:t>
       </w:r>
     </w:p>
     <w:p>
@@ -2285,7 +2813,46 @@
         <w:rPr>
           <w:color w:val="334155"/>
         </w:rPr>
-        <w:t>Branch / Location:** สาขาและสถานที่ปฏิบัติงาน</w:t>
+        <w:t>เปิดคอลัมน์ขั้นตอน Kanban อัตโนมัติ (3 กลุ่มหลัก):**</w:t>
+      </w:r>
+    </w:p>
+    <w:p>
+      <w:pPr>
+        <w:pStyle w:val="ListBullet"/>
+        <w:spacing w:before="30" w:after="30" w:line="276" w:lineRule="auto"/>
+        <w:ind w:left="1080"/>
+      </w:pPr>
+      <w:r>
+        <w:rPr>
+          <w:color w:val="334155"/>
+        </w:rPr>
+        <w:t>⚡ *Quick service (8 ขั้นตอน):* To Do ➔ ชำระเงิน ➔ Assign ช่าง ➔ Check-in ➔ Check-out ➔ QC ➔ Aftersale ➔ Close</w:t>
+      </w:r>
+    </w:p>
+    <w:p>
+      <w:pPr>
+        <w:pStyle w:val="ListBullet"/>
+        <w:spacing w:before="30" w:after="30" w:line="276" w:lineRule="auto"/>
+        <w:ind w:left="1080"/>
+      </w:pPr>
+      <w:r>
+        <w:rPr>
+          <w:color w:val="334155"/>
+        </w:rPr>
+        <w:t>🔧 *MA Service (10 ขั้นตอน):* To Do ➔ Buy-Survey ➔ Survey ➔ ชำระเงิน ➔ Assign ช่าง ➔ Check-in ➔ Check-out ➔ QC ➔ Aftersale ➔ Close</w:t>
+      </w:r>
+    </w:p>
+    <w:p>
+      <w:pPr>
+        <w:pStyle w:val="ListBullet"/>
+        <w:spacing w:before="30" w:after="30" w:line="276" w:lineRule="auto"/>
+        <w:ind w:left="1080"/>
+      </w:pPr>
+      <w:r>
+        <w:rPr>
+          <w:color w:val="334155"/>
+        </w:rPr>
+        <w:t>🏡 *Renovate Service (11 ขั้นตอน):* To Do ➔ Buy-Survey ➔ Survey ➔ Design ➔ ชำระเงิน ➔ Assign ช่าง ➔ Check-in ➔ Check-out ➔ QC ➔ Aftersale ➔ Close</w:t>
       </w:r>
     </w:p>
     <w:p>
@@ -2298,7 +2865,7 @@
         <w:rPr>
           <w:color w:val="334155"/>
         </w:rPr>
-        <w:t>Start Date &amp; Target End Date:** วันที่เริ่มและกำหนดส่งมอบ</w:t>
+        <w:t>ฉีด Task เริ่มต้น:** ดึงแม่แบบงานจาก Master Task Templates เข้าสู่โครงการอัตโนมัติ</w:t>
       </w:r>
     </w:p>
     <w:p>
@@ -2311,44 +2878,8 @@
         <w:rPr>
           <w:color w:val="334155"/>
         </w:rPr>
-        <w:t>Budget:** งบประมาณโครงการ</w:t>
-      </w:r>
-    </w:p>
-    <w:p>
-      <w:pPr>
-        <w:pStyle w:val="ListBullet"/>
-        <w:spacing w:before="30" w:after="30" w:line="276" w:lineRule="auto"/>
-        <w:ind w:left="720"/>
-      </w:pPr>
-      <w:r>
-        <w:rPr>
-          <w:color w:val="334155"/>
-        </w:rPr>
-        <w:t>Project Members:** มอบหมาย PM, Foreman, และสมาชิกทีมช่าง</w:t>
-      </w:r>
-    </w:p>
-    <w:p>
-      <w:pPr>
-        <w:spacing w:before="40" w:after="40" w:line="276" w:lineRule="auto"/>
-        <w:ind w:left="360"/>
-      </w:pPr>
-      <w:r>
-        <w:rPr>
-          <w:b/>
-          <w:color w:val="0284C7"/>
-        </w:rPr>
-        <w:t xml:space="preserve">4. </w:t>
-      </w:r>
-      <w:r>
-        <w:t xml:space="preserve">คลิก </w:t>
-      </w:r>
-      <w:r>
-        <w:rPr>
-          <w:b/>
-        </w:rPr>
-        <w:t>"Create Project"</w:t>
-      </w:r>
-      <w:r/>
+        <w:t>อัปเดตสถานะ:** ปรับ Lead เป็น Converted และผูก ID เชื่อมโยง 1-to-1</w:t>
+      </w:r>
     </w:p>
     <w:p>
       <w:pPr>
@@ -2362,7 +2893,523 @@
           <w:color w:val="475569"/>
           <w:sz w:val="23"/>
         </w:rPr>
-        <w:t>ข. การสร้างและบันทึกแผนแม่บท (Gantt Plan &amp; Baseline)</w:t>
+        <w:t>ค. หัวข้อ: การจัดการแพ็กเกจงานหลายหมวดช่าง (Multi-Trade Modular WBS for Renovate &amp; MA)</w:t>
+      </w:r>
+    </w:p>
+    <w:p>
+      <w:pPr>
+        <w:spacing w:before="40" w:after="40" w:line="276" w:lineRule="auto"/>
+        <w:ind w:left="360"/>
+      </w:pPr>
+      <w:r>
+        <w:rPr>
+          <w:b/>
+          <w:color w:val="0284C7"/>
+        </w:rPr>
+        <w:t xml:space="preserve">1. </w:t>
+      </w:r>
+      <w:r/>
+      <w:r>
+        <w:rPr>
+          <w:b/>
+        </w:rPr>
+        <w:t>โครงสร้างโครงการแบบ WBS (พื้นที่ ➔ หมวดช่าง ➔ Tasks ย่อย):</w:t>
+      </w:r>
+      <w:r/>
+    </w:p>
+    <w:p>
+      <w:pPr>
+        <w:pStyle w:val="ListBullet"/>
+        <w:spacing w:before="30" w:after="30" w:line="276" w:lineRule="auto"/>
+        <w:ind w:left="720"/>
+      </w:pPr>
+      <w:r>
+        <w:rPr>
+          <w:color w:val="334155"/>
+        </w:rPr>
+        <w:t>จัดกลุ่มงานตามพื้นที่ (Area) เช่น *งานปรับปรุงห้องรับแขก*, *งานปรับปรุงห้องครัว*</w:t>
+      </w:r>
+    </w:p>
+    <w:p>
+      <w:pPr>
+        <w:pStyle w:val="ListBullet"/>
+        <w:spacing w:before="30" w:after="30" w:line="276" w:lineRule="auto"/>
+        <w:ind w:left="720"/>
+      </w:pPr>
+      <w:r>
+        <w:rPr>
+          <w:color w:val="334155"/>
+        </w:rPr>
+        <w:t>ในแต่ละพื้นที่ รวมงานหลายหมวดช่างเข้าด้วยกัน: ⚡ ระบบไฟ, ❄️ ระบบแอร์, 🧱 งานฝ้าเพดาน, 🏠 งานปูกระเบื้อง</w:t>
+      </w:r>
+    </w:p>
+    <w:p>
+      <w:pPr>
+        <w:spacing w:before="40" w:after="40" w:line="276" w:lineRule="auto"/>
+        <w:ind w:left="360"/>
+      </w:pPr>
+      <w:r>
+        <w:rPr>
+          <w:b/>
+          <w:color w:val="0284C7"/>
+        </w:rPr>
+        <w:t xml:space="preserve">2. </w:t>
+      </w:r>
+      <w:r/>
+      <w:r>
+        <w:rPr>
+          <w:b/>
+        </w:rPr>
+        <w:t>การเลือกนำเข้าแม่แบบชุดงาน (Modular Template Bundles):</w:t>
+      </w:r>
+      <w:r/>
+    </w:p>
+    <w:p>
+      <w:pPr>
+        <w:pStyle w:val="ListBullet"/>
+        <w:spacing w:before="30" w:after="30" w:line="276" w:lineRule="auto"/>
+        <w:ind w:left="720"/>
+      </w:pPr>
+      <w:r>
+        <w:rPr>
+          <w:color w:val="334155"/>
+        </w:rPr>
+        <w:t xml:space="preserve">ในหน้า Project Plan (Gantt) กดปุ่ม </w:t>
+      </w:r>
+      <w:r>
+        <w:rPr>
+          <w:b/>
+          <w:color w:val="0F172A"/>
+        </w:rPr>
+        <w:t>"+ นำเข้า Tasks ตามหมวดงาน"</w:t>
+      </w:r>
+      <w:r>
+        <w:rPr>
+          <w:color w:val="334155"/>
+        </w:rPr>
+      </w:r>
+    </w:p>
+    <w:p>
+      <w:pPr>
+        <w:pStyle w:val="ListBullet"/>
+        <w:spacing w:before="30" w:after="30" w:line="276" w:lineRule="auto"/>
+        <w:ind w:left="720"/>
+      </w:pPr>
+      <w:r>
+        <w:rPr>
+          <w:color w:val="334155"/>
+        </w:rPr>
+        <w:t>ระบุชื่อพื้นที่ (เช่น *ห้องรับแขก*) และติ๊กเลือกหลายหมวดร่วมกัน [✓] ระบบไฟ [✓] ระบบแอร์ [✓] งานฝ้า</w:t>
+      </w:r>
+    </w:p>
+    <w:p>
+      <w:pPr>
+        <w:pStyle w:val="ListBullet"/>
+        <w:spacing w:before="30" w:after="30" w:line="276" w:lineRule="auto"/>
+        <w:ind w:left="720"/>
+      </w:pPr>
+      <w:r>
+        <w:rPr>
+          <w:color w:val="334155"/>
+        </w:rPr>
+        <w:t>ระบบจะรวม Tasks เข้าสู่โครงการเดียว พร้อมติดแท็กระบุพื้นที่ชัดเจน เช่น [ห้องรับแขก - แอร์] เดินท่อน้ำยาและท่อน้ำทิ้ง</w:t>
+      </w:r>
+    </w:p>
+    <w:p>
+      <w:pPr>
+        <w:spacing w:before="40" w:after="40" w:line="276" w:lineRule="auto"/>
+        <w:ind w:left="360"/>
+      </w:pPr>
+      <w:r>
+        <w:rPr>
+          <w:b/>
+          <w:color w:val="0284C7"/>
+        </w:rPr>
+        <w:t xml:space="preserve">3. </w:t>
+      </w:r>
+      <w:r/>
+      <w:r>
+        <w:rPr>
+          <w:b/>
+        </w:rPr>
+        <w:t>การทำงานของทีมช่าง:</w:t>
+      </w:r>
+      <w:r/>
+    </w:p>
+    <w:p>
+      <w:pPr>
+        <w:pStyle w:val="ListBullet"/>
+        <w:spacing w:before="30" w:after="30" w:line="276" w:lineRule="auto"/>
+        <w:ind w:left="720"/>
+      </w:pPr>
+      <w:r>
+        <w:rPr>
+          <w:color w:val="334155"/>
+        </w:rPr>
+        <w:t>ช่างเฉพาะทางกรองดูเฉพาะแท็กของตนเอง เช่น #ไฟฟ้า หรือ #แอร์ บน Kanban Board</w:t>
+      </w:r>
+    </w:p>
+    <w:p>
+      <w:pPr>
+        <w:pStyle w:val="ListBullet"/>
+        <w:spacing w:before="30" w:after="30" w:line="276" w:lineRule="auto"/>
+        <w:ind w:left="720"/>
+      </w:pPr>
+      <w:r>
+        <w:rPr>
+          <w:color w:val="334155"/>
+        </w:rPr>
+        <w:t>บันทึกเวลา Timesheet ตรงกับ Task ของตนเอง พร้อมแนบภาพถ่ายชิ้นงานเพื่อคำนวณต้นทุนค่าแรงแม่นยำ</w:t>
+      </w:r>
+    </w:p>
+    <w:p>
+      <w:pPr>
+        <w:keepNext/>
+        <w:spacing w:before="160" w:after="60"/>
+      </w:pPr>
+      <w:r>
+        <w:rPr>
+          <w:rFonts w:ascii="Calibri" w:hAnsi="Calibri"/>
+          <w:b/>
+          <w:color w:val="475569"/>
+          <w:sz w:val="23"/>
+        </w:rPr>
+        <w:t>ง. สรุปความแตกต่างสำคัญ: Check-in ช่วงสำรวจ (Survey) vs. Check-in บน Kanban (Execution)</w:t>
+      </w:r>
+    </w:p>
+    <w:p>
+      <w:pPr>
+        <w:spacing w:before="40" w:after="60" w:line="288" w:lineRule="auto"/>
+      </w:pPr>
+      <w:r>
+        <w:t>&gt; [!NOTE]</w:t>
+      </w:r>
+    </w:p>
+    <w:p>
+      <w:pPr>
+        <w:spacing w:before="40" w:after="60" w:line="288" w:lineRule="auto"/>
+      </w:pPr>
+      <w:r>
+        <w:t xml:space="preserve">&gt; </w:t>
+      </w:r>
+      <w:r>
+        <w:rPr>
+          <w:b/>
+        </w:rPr>
+        <w:t>ทำไมระบบถึงมี Check-in 2 จุด?</w:t>
+      </w:r>
+      <w:r/>
+    </w:p>
+    <w:p>
+      <w:pPr>
+        <w:spacing w:before="40" w:after="60" w:line="288" w:lineRule="auto"/>
+      </w:pPr>
+      <w:r>
+        <w:t xml:space="preserve">&gt; * </w:t>
+      </w:r>
+      <w:r>
+        <w:rPr>
+          <w:b/>
+        </w:rPr>
+        <w:t>1. ในขั้นตอน `Survey` (ก่อนแปลงงาน / สำรวจหน้างาน):</w:t>
+      </w:r>
+      <w:r/>
+    </w:p>
+    <w:p>
+      <w:pPr>
+        <w:spacing w:before="40" w:after="60" w:line="288" w:lineRule="auto"/>
+      </w:pPr>
+      <w:r>
+        <w:t xml:space="preserve">&gt;   - การ Check-in / Check-out จะ </w:t>
+      </w:r>
+      <w:r>
+        <w:rPr>
+          <w:b/>
+        </w:rPr>
+        <w:t>ฝังอยู่ข้างในบันทึกผลสำรวจ (Embedded Form)</w:t>
+      </w:r>
+      <w:r/>
+    </w:p>
+    <w:p>
+      <w:pPr>
+        <w:spacing w:before="40" w:after="60" w:line="288" w:lineRule="auto"/>
+      </w:pPr>
+      <w:r>
+        <w:t xml:space="preserve">&gt;   - เป็นการลงพื้นที่ </w:t>
+      </w:r>
+      <w:r>
+        <w:rPr>
+          <w:b/>
+        </w:rPr>
+        <w:t>ครั้งเดียว (Single Visit)</w:t>
+      </w:r>
+      <w:r>
+        <w:t xml:space="preserve"> ของช่าง QC เพื่อเช็คพิกัด GPS วัดพื้นที่ ถ่ายรูป Before และสรุปความต้องการลูกค้าเพื่อส่งต่อให้ดีไซเนอร์ทำแบบ 3D</w:t>
+      </w:r>
+    </w:p>
+    <w:p>
+      <w:pPr>
+        <w:spacing w:before="40" w:after="60" w:line="288" w:lineRule="auto"/>
+      </w:pPr>
+      <w:r>
+        <w:t xml:space="preserve">&gt; * </w:t>
+      </w:r>
+      <w:r>
+        <w:rPr>
+          <w:b/>
+        </w:rPr>
+        <w:t>2. คอลัมน์ `Check-in` และ `Check-out` บน Kanban (หลังแปลงงาน / ก่อสร้างจริง):</w:t>
+      </w:r>
+      <w:r/>
+    </w:p>
+    <w:p>
+      <w:pPr>
+        <w:spacing w:before="40" w:after="60" w:line="288" w:lineRule="auto"/>
+      </w:pPr>
+      <w:r>
+        <w:t xml:space="preserve">&gt;   - แยกเป็นคอลัมน์ขั้นตอนหลักของ </w:t>
+      </w:r>
+      <w:r>
+        <w:rPr>
+          <w:b/>
+        </w:rPr>
+        <w:t>Phase 03: Project Execution</w:t>
+      </w:r>
+      <w:r/>
+    </w:p>
+    <w:p>
+      <w:pPr>
+        <w:spacing w:before="40" w:after="60" w:line="288" w:lineRule="auto"/>
+      </w:pPr>
+      <w:r>
+        <w:t xml:space="preserve">&gt;   - เพราะงานก่อสร้าง/รีโนเวทจริงประกอบด้วย </w:t>
+      </w:r>
+      <w:r>
+        <w:rPr>
+          <w:b/>
+        </w:rPr>
+        <w:t>หลาย Task / หลายทีมช่าง (Multi-Trade)</w:t>
+      </w:r>
+      <w:r>
+        <w:t xml:space="preserve"> เช่น ช่างไฟ ช่างแอร์ ช่างฝ้า ช่างกระเบื้อง</w:t>
+      </w:r>
+    </w:p>
+    <w:p>
+      <w:pPr>
+        <w:spacing w:before="40" w:after="60" w:line="288" w:lineRule="auto"/>
+      </w:pPr>
+      <w:r>
+        <w:t xml:space="preserve">&gt;   - ช่างแต่ละทีมจะเข้าทำงานหลายวัน และกดเช็คอิน-เช็คเอาต์ประจำวัน (Daily Timesheet) แยกตาม </w:t>
+      </w:r>
+      <w:r>
+        <w:rPr>
+          <w:b/>
+        </w:rPr>
+        <w:t>Task ย่อย</w:t>
+      </w:r>
+      <w:r>
+        <w:t xml:space="preserve"> ของตนเอง</w:t>
+      </w:r>
+    </w:p>
+    <w:p>
+      <w:pPr>
+        <w:spacing w:before="40" w:after="60" w:line="288" w:lineRule="auto"/>
+      </w:pPr>
+      <w:r>
+        <w:t>&gt;   - คอลัมน์ Check-in บน Kanban จึงหมายถึงสถานะภาพรวมของโครงการว่า *"กำลังมีทีมช่างเข้าปฏิบัติงานจริงในพื้นที่ (Active Execution)"*</w:t>
+      </w:r>
+    </w:p>
+    <w:p>
+      <w:pPr>
+        <w:keepNext/>
+        <w:spacing w:before="160" w:after="60"/>
+      </w:pPr>
+      <w:r>
+        <w:rPr>
+          <w:rFonts w:ascii="Calibri" w:hAnsi="Calibri"/>
+          <w:b/>
+          <w:color w:val="475569"/>
+          <w:sz w:val="23"/>
+        </w:rPr>
+        <w:t>จ. การสร้างโครงการใหม่โดยตรง (Create New Project)</w:t>
+      </w:r>
+    </w:p>
+    <w:p>
+      <w:pPr>
+        <w:spacing w:before="40" w:after="40" w:line="276" w:lineRule="auto"/>
+        <w:ind w:left="360"/>
+      </w:pPr>
+      <w:r>
+        <w:rPr>
+          <w:b/>
+          <w:color w:val="0284C7"/>
+        </w:rPr>
+        <w:t xml:space="preserve">1. </w:t>
+      </w:r>
+      <w:r>
+        <w:t xml:space="preserve">ไปที่เมนู </w:t>
+      </w:r>
+      <w:r>
+        <w:rPr>
+          <w:b/>
+        </w:rPr>
+        <w:t>"Projects" (`/projects`)</w:t>
+      </w:r>
+      <w:r/>
+    </w:p>
+    <w:p>
+      <w:pPr>
+        <w:spacing w:before="40" w:after="40" w:line="276" w:lineRule="auto"/>
+        <w:ind w:left="360"/>
+      </w:pPr>
+      <w:r>
+        <w:rPr>
+          <w:b/>
+          <w:color w:val="0284C7"/>
+        </w:rPr>
+        <w:t xml:space="preserve">2. </w:t>
+      </w:r>
+      <w:r>
+        <w:t xml:space="preserve">คลิกปุ่ม </w:t>
+      </w:r>
+      <w:r>
+        <w:rPr>
+          <w:b/>
+        </w:rPr>
+        <w:t>"+ Create Project"</w:t>
+      </w:r>
+      <w:r/>
+    </w:p>
+    <w:p>
+      <w:pPr>
+        <w:spacing w:before="40" w:after="40" w:line="276" w:lineRule="auto"/>
+        <w:ind w:left="360"/>
+      </w:pPr>
+      <w:r>
+        <w:rPr>
+          <w:b/>
+          <w:color w:val="0284C7"/>
+        </w:rPr>
+        <w:t xml:space="preserve">3. </w:t>
+      </w:r>
+      <w:r>
+        <w:t>ระบุรายละเอียด:</w:t>
+      </w:r>
+    </w:p>
+    <w:p>
+      <w:pPr>
+        <w:pStyle w:val="ListBullet"/>
+        <w:spacing w:before="30" w:after="30" w:line="276" w:lineRule="auto"/>
+        <w:ind w:left="720"/>
+      </w:pPr>
+      <w:r>
+        <w:rPr>
+          <w:color w:val="334155"/>
+        </w:rPr>
+        <w:t>Project Code &amp; Name:** รหัสและชื่อโครงการ</w:t>
+      </w:r>
+    </w:p>
+    <w:p>
+      <w:pPr>
+        <w:pStyle w:val="ListBullet"/>
+        <w:spacing w:before="30" w:after="30" w:line="276" w:lineRule="auto"/>
+        <w:ind w:left="720"/>
+      </w:pPr>
+      <w:r>
+        <w:rPr>
+          <w:color w:val="334155"/>
+        </w:rPr>
+        <w:t>Project Type:** เลือกประเภทโครงการ (Quick, Renovate, MA)</w:t>
+      </w:r>
+    </w:p>
+    <w:p>
+      <w:pPr>
+        <w:pStyle w:val="ListBullet"/>
+        <w:spacing w:before="30" w:after="30" w:line="276" w:lineRule="auto"/>
+        <w:ind w:left="720"/>
+      </w:pPr>
+      <w:r>
+        <w:rPr>
+          <w:color w:val="334155"/>
+        </w:rPr>
+        <w:t>Branch / Location:** สาขาและสถานที่ปฏิบัติงาน</w:t>
+      </w:r>
+    </w:p>
+    <w:p>
+      <w:pPr>
+        <w:pStyle w:val="ListBullet"/>
+        <w:spacing w:before="30" w:after="30" w:line="276" w:lineRule="auto"/>
+        <w:ind w:left="720"/>
+      </w:pPr>
+      <w:r>
+        <w:rPr>
+          <w:color w:val="334155"/>
+        </w:rPr>
+        <w:t>Start Date &amp; Target End Date:** วันที่เริ่มและกำหนดส่งมอบ</w:t>
+      </w:r>
+    </w:p>
+    <w:p>
+      <w:pPr>
+        <w:pStyle w:val="ListBullet"/>
+        <w:spacing w:before="30" w:after="30" w:line="276" w:lineRule="auto"/>
+        <w:ind w:left="720"/>
+      </w:pPr>
+      <w:r>
+        <w:rPr>
+          <w:color w:val="334155"/>
+        </w:rPr>
+        <w:t>Budget:** งบประมาณโครงการ</w:t>
+      </w:r>
+    </w:p>
+    <w:p>
+      <w:pPr>
+        <w:pStyle w:val="ListBullet"/>
+        <w:spacing w:before="30" w:after="30" w:line="276" w:lineRule="auto"/>
+        <w:ind w:left="720"/>
+      </w:pPr>
+      <w:r>
+        <w:rPr>
+          <w:color w:val="334155"/>
+        </w:rPr>
+        <w:t>Project Members:** มอบหมาย PM, Foreman, และสมาชิกทีมช่าง</w:t>
+      </w:r>
+    </w:p>
+    <w:p>
+      <w:pPr>
+        <w:spacing w:before="40" w:after="40" w:line="276" w:lineRule="auto"/>
+        <w:ind w:left="360"/>
+      </w:pPr>
+      <w:r>
+        <w:rPr>
+          <w:b/>
+          <w:color w:val="0284C7"/>
+        </w:rPr>
+        <w:t xml:space="preserve">4. </w:t>
+      </w:r>
+      <w:r>
+        <w:t xml:space="preserve">คลิก </w:t>
+      </w:r>
+      <w:r>
+        <w:rPr>
+          <w:b/>
+        </w:rPr>
+        <w:t>"Create Project"</w:t>
+      </w:r>
+      <w:r/>
+    </w:p>
+    <w:p>
+      <w:pPr>
+        <w:keepNext/>
+        <w:spacing w:before="160" w:after="60"/>
+      </w:pPr>
+      <w:r>
+        <w:rPr>
+          <w:rFonts w:ascii="Calibri" w:hAnsi="Calibri"/>
+          <w:b/>
+          <w:color w:val="475569"/>
+          <w:sz w:val="23"/>
+        </w:rPr>
+        <w:t>จ. การสร้างและบันทึกแผนแม่บท (Gantt Plan &amp; Baseline)</w:t>
       </w:r>
     </w:p>
     <w:p>
@@ -3689,23 +4736,75 @@
         <w:rPr>
           <w:b/>
         </w:rPr>
-        <w:t>One-Click Project Conversion:</w:t>
-      </w:r>
-      <w:r>
-        <w:t xml:space="preserve"> เมื่อลูกค้าตอบรับใบเสนอราคา PM สามารถกดปุ่ม </w:t>
+        <w:t>Site Visit Results &amp; Post-Visit Actions:</w:t>
+      </w:r>
+      <w:r>
+        <w:t xml:space="preserve"> หน้าจอบันทึกผลการไป Visit Site ลูกค้า (กดปุ่ม </w:t>
       </w:r>
       <w:r>
         <w:rPr>
           <w:b/>
         </w:rPr>
-        <w:t>"Convert to Project"</w:t>
-      </w:r>
-      <w:r>
-        <w:t xml:space="preserve"> ระบบจะสร้างโครงการใหม่พร้อมดึงข้อมูลลูกค้าและสาขาให้อัตโนมัติ</w:t>
+        <w:t>"📋 บันทึกผล Visit"</w:t>
+      </w:r>
+      <w:r>
+        <w:t xml:space="preserve"> จากหน้ารายชื่อ Leads หรือหน้าจออนุมัตินัดหมาย)</w:t>
       </w:r>
     </w:p>
     <w:p>
       <w:pPr>
+        <w:pStyle w:val="ListBullet"/>
+        <w:spacing w:before="30" w:after="30" w:line="276" w:lineRule="auto"/>
+        <w:ind w:left="720"/>
+      </w:pPr>
+      <w:r>
+        <w:rPr>
+          <w:color w:val="334155"/>
+        </w:rPr>
+        <w:t>บันทึกสภาพหน้างาน ขอบเขตงาน และงบประมาณประเมิน</w:t>
+      </w:r>
+    </w:p>
+    <w:p>
+      <w:pPr>
+        <w:pStyle w:val="ListBullet"/>
+        <w:spacing w:before="30" w:after="30" w:line="276" w:lineRule="auto"/>
+        <w:ind w:left="720"/>
+      </w:pPr>
+      <w:r>
+        <w:rPr>
+          <w:color w:val="334155"/>
+        </w:rPr>
+        <w:t>บันทึกความต้องการและการตัดสินใจของลูกค้า</w:t>
+      </w:r>
+    </w:p>
+    <w:p>
+      <w:pPr>
+        <w:pStyle w:val="ListBullet"/>
+        <w:spacing w:before="30" w:after="30" w:line="276" w:lineRule="auto"/>
+        <w:ind w:left="720"/>
+      </w:pPr>
+      <w:r>
+        <w:rPr>
+          <w:color w:val="334155"/>
+        </w:rPr>
+        <w:t>กำหนดขั้นตอนถัดไป (เช่น ส่งใบเสนอราคา -&gt; ปรับสถานะเป็น Pending Quote อัตโนมัติ, โทรติดตาม, นัด Visit ใหม่) พร้อมหมายเหตุลับเฉพาะทีม</w:t>
+      </w:r>
+    </w:p>
+    <w:p>
+      <w:pPr>
+        <w:pStyle w:val="ListBullet"/>
+        <w:spacing w:before="30" w:after="30" w:line="276" w:lineRule="auto"/>
+        <w:ind w:left="720"/>
+      </w:pPr>
+      <w:r>
+        <w:rPr>
+          <w:color w:val="334155"/>
+        </w:rPr>
+        <w:t>มีแท็บประวัติการลงพื้นที่ย้อนหลังแบบ Timeline ละเอียดยิบ</w:t>
+      </w:r>
+    </w:p>
+    <w:p>
+      <w:pPr>
         <w:spacing w:before="40" w:after="40" w:line="276" w:lineRule="auto"/>
         <w:ind w:left="360"/>
       </w:pPr>
@@ -3715,6 +4814,38 @@
           <w:color w:val="0284C7"/>
         </w:rPr>
         <w:t xml:space="preserve">3. </w:t>
+      </w:r>
+      <w:r/>
+      <w:r>
+        <w:rPr>
+          <w:b/>
+        </w:rPr>
+        <w:t>One-Click Project Conversion:</w:t>
+      </w:r>
+      <w:r>
+        <w:t xml:space="preserve"> เมื่อลูกค้าตอบรับใบเสนอราคา PM สามารถกดปุ่ม </w:t>
+      </w:r>
+      <w:r>
+        <w:rPr>
+          <w:b/>
+        </w:rPr>
+        <w:t>"Convert to Project"</w:t>
+      </w:r>
+      <w:r>
+        <w:t xml:space="preserve"> ระบบจะสร้างโครงการใหม่พร้อมดึงข้อมูลลูกค้าและสาขาให้อัตโนมัติ</w:t>
+      </w:r>
+    </w:p>
+    <w:p>
+      <w:pPr>
+        <w:spacing w:before="40" w:after="40" w:line="276" w:lineRule="auto"/>
+        <w:ind w:left="360"/>
+      </w:pPr>
+      <w:r>
+        <w:rPr>
+          <w:b/>
+          <w:color w:val="0284C7"/>
+        </w:rPr>
+        <w:t xml:space="preserve">4. </w:t>
       </w:r>
       <w:r/>
       <w:r>

</xml_diff>

<commit_message>
docs(km): update in-app KnowledgeBase, System Training Manual and docx with LINE Login 3-tier auth, 5-slot proof of work photo grid, and Step 7 INT technician assignment
</commit_message>
<xml_diff>
--- a/NexTime_System_Training_Manual.docx
+++ b/NexTime_System_Training_Manual.docx
@@ -656,10 +656,75 @@
         <w:rPr>
           <w:b/>
         </w:rPr>
-        <w:t>Email / Password Authentication:</w:t>
-      </w:r>
-      <w:r>
-        <w:t xml:space="preserve"> เข้าสู่ระบบด้วยอีเมลองค์กรและรหัสผ่านที่เข้ารหัสความปลอดภัยระดับ SHA-256</w:t>
+        <w:t>Email / Username &amp; Password Authentication:</w:t>
+      </w:r>
+      <w:r>
+        <w:t xml:space="preserve"> เข้าสู่ระบบด้วยอีเมลองค์กรหรือรหัสผู้ใช้งาน และรหัสผ่านที่เข้ารหัสความปลอดภัยระดับ SHA-256</w:t>
+      </w:r>
+    </w:p>
+    <w:p>
+      <w:pPr>
+        <w:pStyle w:val="ListBullet"/>
+        <w:spacing w:before="30" w:after="30" w:line="276" w:lineRule="auto"/>
+        <w:ind w:left="720"/>
+      </w:pPr>
+      <w:r>
+        <w:rPr>
+          <w:color w:val="334155"/>
+        </w:rPr>
+        <w:t>บัญชีช่างเริ่มต้นในระบบ:*</w:t>
+      </w:r>
+    </w:p>
+    <w:p>
+      <w:pPr>
+        <w:pStyle w:val="ListBullet"/>
+        <w:spacing w:before="30" w:after="30" w:line="276" w:lineRule="auto"/>
+        <w:ind w:left="1080"/>
+      </w:pPr>
+      <w:r>
+        <w:rPr>
+          <w:color w:val="334155"/>
+        </w:rPr>
+        <w:t>somjai.tech@chg.co.th / tech_elec_01 (ช่างไฟฟ้า) — รหัสผ่านเริ่มต้น 123456</w:t>
+      </w:r>
+    </w:p>
+    <w:p>
+      <w:pPr>
+        <w:pStyle w:val="ListBullet"/>
+        <w:spacing w:before="30" w:after="30" w:line="276" w:lineRule="auto"/>
+        <w:ind w:left="1080"/>
+      </w:pPr>
+      <w:r>
+        <w:rPr>
+          <w:color w:val="334155"/>
+        </w:rPr>
+        <w:t>narong.tech@chg.co.th / tech_craft_02 (ช่างฝีมือ/ฝ้า) — รหัสผ่านเริ่มต้น 123456</w:t>
+      </w:r>
+    </w:p>
+    <w:p>
+      <w:pPr>
+        <w:pStyle w:val="ListBullet"/>
+        <w:spacing w:before="30" w:after="30" w:line="276" w:lineRule="auto"/>
+        <w:ind w:left="1080"/>
+      </w:pPr>
+      <w:r>
+        <w:rPr>
+          <w:color w:val="334155"/>
+        </w:rPr>
+        <w:t>wichai.tech@chg.co.th / tech_gen_03 (ช่างทั่วไป) — รหัสผ่านเริ่มต้น 123456</w:t>
+      </w:r>
+    </w:p>
+    <w:p>
+      <w:pPr>
+        <w:pStyle w:val="ListBullet"/>
+        <w:spacing w:before="30" w:after="30" w:line="276" w:lineRule="auto"/>
+        <w:ind w:left="1080"/>
+      </w:pPr>
+      <w:r>
+        <w:rPr>
+          <w:color w:val="334155"/>
+        </w:rPr>
+        <w:t>chapirak@gmail.com / u_chapirak (ผู้ดูแลระบบ Admin) — รหัสผ่านเริ่มต้น 123456</w:t>
       </w:r>
     </w:p>
     <w:p>
@@ -679,10 +744,47 @@
         <w:rPr>
           <w:b/>
         </w:rPr>
-        <w:t>LINE Login Integration:</w:t>
-      </w:r>
-      <w:r>
-        <w:t xml:space="preserve"> สแกน QR Code หรือเข้าสู่ระบบผ่าน LINE Account (ระบบทำการ Auto-binding กับอีเมลบริษัทในฐานข้อมูล)</w:t>
+        <w:t>LINE Login OAuth 2.0 (ระบบยืนยันตัวตนอัจฉริยะ 3 ระดับ):</w:t>
+      </w:r>
+      <w:r/>
+    </w:p>
+    <w:p>
+      <w:pPr>
+        <w:pStyle w:val="ListBullet"/>
+        <w:spacing w:before="30" w:after="30" w:line="276" w:lineRule="auto"/>
+        <w:ind w:left="720"/>
+      </w:pPr>
+      <w:r>
+        <w:rPr>
+          <w:color w:val="334155"/>
+        </w:rPr>
+        <w:t>สเต็ป 1 (Saved Account):** ล็อกอินด้วย LINE User ID (รหัสเฉพาะขึ้นต้นด้วยตัว U) โดยไม่ต้องจำรหัสผ่าน</w:t>
+      </w:r>
+    </w:p>
+    <w:p>
+      <w:pPr>
+        <w:pStyle w:val="ListBullet"/>
+        <w:spacing w:before="30" w:after="30" w:line="276" w:lineRule="auto"/>
+        <w:ind w:left="720"/>
+      </w:pPr>
+      <w:r>
+        <w:rPr>
+          <w:color w:val="334155"/>
+        </w:rPr>
+        <w:t>สเต็ป 2 (Auto-Binding):** ล็อกอินครั้งแรก หากอีเมลหรือชื่อตรงกับฐานข้อมูล ระบบจะผูกบัญชีให้อัตโนมัติทันที</w:t>
+      </w:r>
+    </w:p>
+    <w:p>
+      <w:pPr>
+        <w:pStyle w:val="ListBullet"/>
+        <w:spacing w:before="30" w:after="30" w:line="276" w:lineRule="auto"/>
+        <w:ind w:left="720"/>
+      </w:pPr>
+      <w:r>
+        <w:rPr>
+          <w:color w:val="334155"/>
+        </w:rPr>
+        <w:t>สเต็ป 3 (Auto-Provisioning):** หากเป็นช่างใหม่ที่ไม่มีชื่อในระบบ ระบบจะสร้างบัญชีใหม่อัตโนมัติในฐานะ Employee (ทีมช่างหน้างาน) พร้อมดึงรูปโปรไฟล์และชื่อจาก LINE เข้าสู่ระบบได้ทันที</w:t>
       </w:r>
     </w:p>
     <w:p>
@@ -1989,7 +2091,7 @@
                 <w:color w:val="333333"/>
                 <w:sz w:val="19"/>
               </w:rPr>
-              <w:t>สร้างแผนงาน WBS, มอบหมายช่าง JMT และเช็คอิน GPS</w:t>
+              <w:t>สร้างแผนงาน WBS, มอบหมายช่าง INT และเช็คอิน GPS</w:t>
             </w:r>
           </w:p>
         </w:tc>
@@ -4889,7 +4991,149 @@
         <w:spacing w:before="40" w:after="60" w:line="288" w:lineRule="auto"/>
       </w:pPr>
       <w:r>
-        <w:t>ระบบ Gantt Chart ของ NexTime รองรับการทำงานเชิงลึก:</w:t>
+        <w:t>ระบบ Gantt Chart และแผนงานโครงการของ NexTime รองรับการทำงานเชิงลึก:</w:t>
+      </w:r>
+    </w:p>
+    <w:p>
+      <w:pPr>
+        <w:pStyle w:val="ListBullet"/>
+        <w:spacing w:before="30" w:after="30" w:line="276" w:lineRule="auto"/>
+        <w:ind w:left="360"/>
+      </w:pPr>
+      <w:r>
+        <w:rPr>
+          <w:color w:val="334155"/>
+        </w:rPr>
+        <w:t>การคำนวณความก้าวหน้าโครงการ (Progress Calculation %):**</w:t>
+      </w:r>
+    </w:p>
+    <w:p>
+      <w:pPr>
+        <w:pStyle w:val="ListBullet"/>
+        <w:spacing w:before="30" w:after="30" w:line="276" w:lineRule="auto"/>
+        <w:ind w:left="720"/>
+      </w:pPr>
+      <w:r>
+        <w:rPr>
+          <w:color w:val="334155"/>
+        </w:rPr>
+        <w:t>ระดับ Milestone งานหลัก:**</w:t>
+      </w:r>
+    </w:p>
+    <w:p>
+      <w:pPr>
+        <w:pStyle w:val="ListBullet"/>
+        <w:spacing w:before="30" w:after="30" w:line="276" w:lineRule="auto"/>
+        <w:ind w:left="1080"/>
+      </w:pPr>
+      <w:r>
+        <w:rPr>
+          <w:color w:val="334155"/>
+        </w:rPr>
+        <w:t>กรณีมีงานย่อย (Subtasks):* คำนวณจากสูตร $(\text{จำนวน Subtask ที่สถานะ Done} / \text{จำนวน Subtask ทั้งหมด}) \times 100\%$</w:t>
+      </w:r>
+    </w:p>
+    <w:p>
+      <w:pPr>
+        <w:pStyle w:val="ListBullet"/>
+        <w:spacing w:before="30" w:after="30" w:line="276" w:lineRule="auto"/>
+        <w:ind w:left="1080"/>
+      </w:pPr>
+      <w:r>
+        <w:rPr>
+          <w:color w:val="334155"/>
+        </w:rPr>
+        <w:t>กรณีไม่มีงานย่อย:* คำนวณตามสถานะของงานหลักโดยตรง (To Do = 0%, In Progress = 50%, Review = 90%, Done = 100%)</w:t>
+      </w:r>
+    </w:p>
+    <w:p>
+      <w:pPr>
+        <w:pStyle w:val="ListBullet"/>
+        <w:spacing w:before="30" w:after="30" w:line="276" w:lineRule="auto"/>
+        <w:ind w:left="720"/>
+      </w:pPr>
+      <w:r>
+        <w:rPr>
+          <w:color w:val="334155"/>
+        </w:rPr>
+        <w:t>ระดับภาพรวมโครงการ (Overall Milestones Progress):** คำนวณจากค่าเฉลี่ยทางคณิตศาสตร์ของ % Progress ของทุก Milestone หลักในโครงการ</w:t>
+      </w:r>
+    </w:p>
+    <w:p>
+      <w:pPr>
+        <w:pStyle w:val="ListBullet"/>
+        <w:spacing w:before="30" w:after="30" w:line="276" w:lineRule="auto"/>
+        <w:ind w:left="360"/>
+      </w:pPr>
+      <w:r>
+        <w:rPr>
+          <w:color w:val="334155"/>
+        </w:rPr>
+        <w:t>ช่องทางการอัปเดตความก้าวหน้า (4 ช่องทาง):**</w:t>
+      </w:r>
+    </w:p>
+    <w:p>
+      <w:pPr>
+        <w:spacing w:before="40" w:after="40" w:line="276" w:lineRule="auto"/>
+        <w:ind w:left="360"/>
+      </w:pPr>
+      <w:r>
+        <w:rPr>
+          <w:b/>
+          <w:color w:val="0284C7"/>
+        </w:rPr>
+        <w:t xml:space="preserve">1. </w:t>
+      </w:r>
+      <w:r>
+        <w:t>*หน้าแผนงาน / Gantt:* กดปุ่มดินสอ ✏️ แก้ไขสถานะของงานหลัก/งานย่อยในตาราง Milestones &amp; Subtasks</w:t>
+      </w:r>
+    </w:p>
+    <w:p>
+      <w:pPr>
+        <w:spacing w:before="40" w:after="40" w:line="276" w:lineRule="auto"/>
+        <w:ind w:left="360"/>
+      </w:pPr>
+      <w:r>
+        <w:rPr>
+          <w:b/>
+          <w:color w:val="0284C7"/>
+        </w:rPr>
+        <w:t xml:space="preserve">2. </w:t>
+      </w:r>
+      <w:r>
+        <w:t>*หน้าขั้นตอนงาน &amp; QC:* ตรวจสอบ Checklist และปรับสถานะงานเป็น Done</w:t>
+      </w:r>
+    </w:p>
+    <w:p>
+      <w:pPr>
+        <w:spacing w:before="40" w:after="40" w:line="276" w:lineRule="auto"/>
+        <w:ind w:left="360"/>
+      </w:pPr>
+      <w:r>
+        <w:rPr>
+          <w:b/>
+          <w:color w:val="0284C7"/>
+        </w:rPr>
+        <w:t xml:space="preserve">3. </w:t>
+      </w:r>
+      <w:r>
+        <w:t>*หน้าโปรเจกต์บอร์ด (Kanban):* ลากการ์ดงานข้ามคอลัมน์ไปยัง Done</w:t>
+      </w:r>
+    </w:p>
+    <w:p>
+      <w:pPr>
+        <w:spacing w:before="40" w:after="40" w:line="276" w:lineRule="auto"/>
+        <w:ind w:left="360"/>
+      </w:pPr>
+      <w:r>
+        <w:rPr>
+          <w:b/>
+          <w:color w:val="0284C7"/>
+        </w:rPr>
+        <w:t xml:space="preserve">4. </w:t>
+      </w:r>
+      <w:r>
+        <w:t>*หน้าบันทึกหน้างาน / เช็คอินช่าง:* ช่างส่งภาพรายงานหน้างานประจำวัน และ PM กดตรวจรับงาน</w:t>
       </w:r>
     </w:p>
     <w:p>
@@ -5097,7 +5341,7 @@
         <w:rPr>
           <w:color w:val="334155"/>
         </w:rPr>
-        <w:t>Interactive Time Bar:** ลากปรับช่วงเวลาทำงานและชั่วโมงที่ใช้จริงบนแถบกราฟิก 24 ชั่วโมง</w:t>
+        <w:t>Interactive Time Bar:** ลากปรับช่วงเวลาทำงานและชั่วโมงที่ใช้จริงบนแถบกราฟิก 24 ชั่วโมง พร้อมคำนวณชั่วโมงสุทธิอัตโนมัติ</w:t>
       </w:r>
     </w:p>
     <w:p>
@@ -5110,7 +5354,150 @@
         <w:rPr>
           <w:color w:val="334155"/>
         </w:rPr>
-        <w:t>HTML5 Camera API:** ถ่ายรูปผ่านกล้องเบราว์เซอร์ได้ทันทีโดยไม่ต้องโหลดแอปเพิ่ม</w:t>
+        <w:t>ระบบภาพถ่ายหลักฐานการทำงาน 5 ช่องมาตรฐาน (5-Slot Standard Proof of Work Grid):**</w:t>
+      </w:r>
+    </w:p>
+    <w:p>
+      <w:pPr>
+        <w:pStyle w:val="ListBullet"/>
+        <w:spacing w:before="30" w:after="30" w:line="276" w:lineRule="auto"/>
+        <w:ind w:left="720"/>
+      </w:pPr>
+      <w:r>
+        <w:rPr>
+          <w:color w:val="334155"/>
+        </w:rPr>
+        <w:t>🚩 ช่อง 1 (ก่อนเริ่มงาน):** บันทึกสภาพเดิม / ป้ายหน้างาน / จุดเตรียมพื้นที่</w:t>
+      </w:r>
+    </w:p>
+    <w:p>
+      <w:pPr>
+        <w:pStyle w:val="ListBullet"/>
+        <w:spacing w:before="30" w:after="30" w:line="276" w:lineRule="auto"/>
+        <w:ind w:left="720"/>
+      </w:pPr>
+      <w:r>
+        <w:rPr>
+          <w:color w:val="334155"/>
+        </w:rPr>
+        <w:t>⚙️ ช่อง 2 (ระหว่างทำ 1):** งานขั้นตอนหลัก / งานรื้อถอน / งานวางท่อ / โครงสร้าง</w:t>
+      </w:r>
+    </w:p>
+    <w:p>
+      <w:pPr>
+        <w:pStyle w:val="ListBullet"/>
+        <w:spacing w:before="30" w:after="30" w:line="276" w:lineRule="auto"/>
+        <w:ind w:left="720"/>
+      </w:pPr>
+      <w:r>
+        <w:rPr>
+          <w:color w:val="334155"/>
+        </w:rPr>
+        <w:t>🔨 ช่อง 3 (ระหว่างทำ 2):** งานประกอบ / งานติดตั้งอุปกรณ์ / งานระบบไฟฟ้า-ประปา</w:t>
+      </w:r>
+    </w:p>
+    <w:p>
+      <w:pPr>
+        <w:pStyle w:val="ListBullet"/>
+        <w:spacing w:before="30" w:after="30" w:line="276" w:lineRule="auto"/>
+        <w:ind w:left="720"/>
+      </w:pPr>
+      <w:r>
+        <w:rPr>
+          <w:color w:val="334155"/>
+        </w:rPr>
+        <w:t>✅ ช่อง 4 (หลังเสร็จสิ้น):** ผลงานที่ทำเสร็จสมบูรณ์เรียบร้อย</w:t>
+      </w:r>
+    </w:p>
+    <w:p>
+      <w:pPr>
+        <w:pStyle w:val="ListBullet"/>
+        <w:spacing w:before="30" w:after="30" w:line="276" w:lineRule="auto"/>
+        <w:ind w:left="720"/>
+      </w:pPr>
+      <w:r>
+        <w:rPr>
+          <w:color w:val="334155"/>
+        </w:rPr>
+        <w:t>📐 ช่อง 5 (วัดระยะ / QC):** ตรวจสอบระดับน้ำ / ตลับเมตร / จุดควบคุมคุณภาพ</w:t>
+      </w:r>
+    </w:p>
+    <w:p>
+      <w:pPr>
+        <w:pStyle w:val="ListBullet"/>
+        <w:spacing w:before="30" w:after="30" w:line="276" w:lineRule="auto"/>
+        <w:ind w:left="360"/>
+      </w:pPr>
+      <w:r>
+        <w:rPr>
+          <w:color w:val="334155"/>
+        </w:rPr>
+        <w:t>Batch Multi-Upload &amp; Live Camera:**</w:t>
+      </w:r>
+    </w:p>
+    <w:p>
+      <w:pPr>
+        <w:pStyle w:val="ListBullet"/>
+        <w:spacing w:before="30" w:after="30" w:line="276" w:lineRule="auto"/>
+        <w:ind w:left="720"/>
+      </w:pPr>
+      <w:r>
+        <w:rPr>
+          <w:color w:val="334155"/>
+        </w:rPr>
+        <w:t>กดปุ่ม [⬆️ เลือกพร้อมกัน 5 รูป] เพื่ออัปโหลดรูปภาพหลายไฟล์พร้อมกันแบบรวดเดียว</w:t>
+      </w:r>
+    </w:p>
+    <w:p>
+      <w:pPr>
+        <w:pStyle w:val="ListBullet"/>
+        <w:spacing w:before="30" w:after="30" w:line="276" w:lineRule="auto"/>
+        <w:ind w:left="720"/>
+      </w:pPr>
+      <w:r>
+        <w:rPr>
+          <w:color w:val="334155"/>
+        </w:rPr>
+        <w:t>กดปุ่ม [📷 เปิดกล้อง] ถ่ายรูปสดผ่านกล้องมือถือโดยตรงลงตามช่องที่กำหนด</w:t>
+      </w:r>
+    </w:p>
+    <w:p>
+      <w:pPr>
+        <w:pStyle w:val="ListBullet"/>
+        <w:spacing w:before="30" w:after="30" w:line="276" w:lineRule="auto"/>
+        <w:ind w:left="720"/>
+      </w:pPr>
+      <w:r>
+        <w:rPr>
+          <w:color w:val="334155"/>
+        </w:rPr>
+        <w:t xml:space="preserve">แต่ละช่องสามารถกด </w:t>
+      </w:r>
+      <w:r>
+        <w:rPr>
+          <w:b/>
+          <w:color w:val="0F172A"/>
+        </w:rPr>
+        <w:t>🔍 ซูมดูรูปขนาดเต็ม (Lightbox)</w:t>
+      </w:r>
+      <w:r>
+        <w:rPr>
+          <w:color w:val="334155"/>
+        </w:rPr>
+        <w:t xml:space="preserve"> หรือ </w:t>
+      </w:r>
+      <w:r>
+        <w:rPr>
+          <w:b/>
+          <w:color w:val="0F172A"/>
+        </w:rPr>
+        <w:t>🗑️ ลบรูป</w:t>
+      </w:r>
+      <w:r>
+        <w:rPr>
+          <w:color w:val="334155"/>
+        </w:rPr>
+        <w:t xml:space="preserve"> เพื่อถ่ายใหม่ได้</w:t>
       </w:r>
     </w:p>
     <w:p>

</xml_diff>